<commit_message>
Maven structure + Scanner-based tests
</commit_message>
<xml_diff>
--- a/Creational_Design_Patterns_Report.docx
+++ b/Creational_Design_Patterns_Report.docx
@@ -40,9 +40,7 @@
       </w:r>
     </w:p>
     <w:p>
-      <w:r>
-        <w:br w:type="page"/>
-      </w:r>
+      <w:r/>
     </w:p>
     <w:p>
       <w:pPr>
@@ -98,9 +96,7 @@
       </w:r>
     </w:p>
     <w:p>
-      <w:r>
-        <w:br w:type="page"/>
-      </w:r>
+      <w:r/>
     </w:p>
     <w:p>
       <w:pPr>
@@ -674,7 +670,7 @@
         <w:pStyle w:val="Heading2"/>
       </w:pPr>
       <w:r>
-        <w:t>JUnit Test Cases</w:t>
+        <w:t>Test Cases</w:t>
       </w:r>
     </w:p>
     <w:p>
@@ -701,7 +697,7 @@
         <w:t>import org.junit.jupiter.api.Test;</w:t>
         <w:br/>
         <w:br/>
-        <w:t>// JUnit 5 tests to verify Singleton behavior</w:t>
+        <w:t>// Console-based tests to verify Singleton behavior</w:t>
         <w:br/>
         <w:t>class CollegeConfigTest {</w:t>
         <w:br/>
@@ -814,9 +810,7 @@
       </w:r>
     </w:p>
     <w:p>
-      <w:r>
-        <w:br w:type="page"/>
-      </w:r>
+      <w:r/>
     </w:p>
     <w:p>
       <w:pPr>
@@ -1486,7 +1480,7 @@
         <w:pStyle w:val="Heading2"/>
       </w:pPr>
       <w:r>
-        <w:t>JUnit Test Cases</w:t>
+        <w:t>Test Cases</w:t>
       </w:r>
     </w:p>
     <w:p>
@@ -1513,7 +1507,7 @@
         <w:t>import org.junit.jupiter.api.Test;</w:t>
         <w:br/>
         <w:br/>
-        <w:t>// JUnit 5 tests to verify Factory pattern behavior</w:t>
+        <w:t>// Console-based tests to verify Factory pattern behavior</w:t>
         <w:br/>
         <w:t>class NotificationFactoryTest {</w:t>
         <w:br/>
@@ -1645,9 +1639,7 @@
       </w:r>
     </w:p>
     <w:p>
-      <w:r>
-        <w:br w:type="page"/>
-      </w:r>
+      <w:r/>
     </w:p>
     <w:p>
       <w:pPr>
@@ -2340,7 +2332,7 @@
         <w:pStyle w:val="Heading2"/>
       </w:pPr>
       <w:r>
-        <w:t>JUnit Test Cases</w:t>
+        <w:t>Test Cases</w:t>
       </w:r>
     </w:p>
     <w:p>
@@ -2367,7 +2359,7 @@
         <w:t>import org.junit.jupiter.api.Test;</w:t>
         <w:br/>
         <w:br/>
-        <w:t>// JUnit 5 tests to verify Builder pattern behavior</w:t>
+        <w:t>// Console-based tests to verify Builder pattern behavior</w:t>
         <w:br/>
         <w:t>class StudentBuilderTest {</w:t>
         <w:br/>
@@ -2601,9 +2593,7 @@
       </w:r>
     </w:p>
     <w:p>
-      <w:r>
-        <w:br w:type="page"/>
-      </w:r>
+      <w:r/>
     </w:p>
     <w:p>
       <w:pPr>
@@ -3134,7 +3124,7 @@
         <w:pStyle w:val="Heading2"/>
       </w:pPr>
       <w:r>
-        <w:t>JUnit Test Cases</w:t>
+        <w:t>Test Cases</w:t>
       </w:r>
     </w:p>
     <w:p>
@@ -3279,9 +3269,7 @@
       </w:r>
     </w:p>
     <w:p>
-      <w:r>
-        <w:br w:type="page"/>
-      </w:r>
+      <w:r/>
     </w:p>
     <w:p>
       <w:pPr>
@@ -3938,7 +3926,7 @@
         <w:pStyle w:val="Heading2"/>
       </w:pPr>
       <w:r>
-        <w:t>JUnit Test Cases</w:t>
+        <w:t>Test Cases</w:t>
       </w:r>
     </w:p>
     <w:p>
@@ -3964,7 +3952,7 @@
         <w:t>import org.junit.jupiter.api.Test;</w:t>
         <w:br/>
         <w:br/>
-        <w:t>// JUnit 5 tests to verify Facade pattern behavior</w:t>
+        <w:t>// Console-based tests to verify Facade pattern behavior</w:t>
         <w:br/>
         <w:t>class FacadeTest {</w:t>
         <w:br/>
@@ -4098,9 +4086,7 @@
       </w:r>
     </w:p>
     <w:p>
-      <w:r>
-        <w:br w:type="page"/>
-      </w:r>
+      <w:r/>
     </w:p>
     <w:p>
       <w:pPr>
@@ -4669,7 +4655,7 @@
         <w:pStyle w:val="Heading2"/>
       </w:pPr>
       <w:r>
-        <w:t>JUnit Test Cases</w:t>
+        <w:t>Test Cases</w:t>
       </w:r>
     </w:p>
     <w:p>
@@ -4695,7 +4681,7 @@
         <w:t>import org.junit.jupiter.api.Test;</w:t>
         <w:br/>
         <w:br/>
-        <w:t>// JUnit 5 tests to verify Proxy pattern behavior</w:t>
+        <w:t>// Console-based tests to verify Proxy pattern behavior</w:t>
         <w:br/>
         <w:t>class ProxyTest {</w:t>
         <w:br/>
@@ -4765,7 +4751,7 @@
         <w:pStyle w:val="ListBullet"/>
       </w:pPr>
       <w:r>
-        <w:t>testAdminCanViewMarks(): Verifies ADMIN role is allowed to view marks.</w:t>
+        <w:t>testAdminAccessAllowed(): Verifies ADMIN role is allowed to view marks.</w:t>
       </w:r>
     </w:p>
     <w:p>
@@ -4773,7 +4759,7 @@
         <w:pStyle w:val="ListBullet"/>
       </w:pPr>
       <w:r>
-        <w:t>testStudentCannotViewMarks(): Verifies STUDENT role is denied (no exception thrown).</w:t>
+        <w:t>testStudentAccessDenied(): Verifies STUDENT role is denied (no exception thrown).</w:t>
       </w:r>
     </w:p>
     <w:p>
@@ -4806,9 +4792,7 @@
       </w:r>
     </w:p>
     <w:p>
-      <w:r>
-        <w:br w:type="page"/>
-      </w:r>
+      <w:r/>
     </w:p>
     <w:p>
       <w:pPr>
@@ -5546,7 +5530,7 @@
         <w:pStyle w:val="Heading2"/>
       </w:pPr>
       <w:r>
-        <w:t>JUnit Test Cases</w:t>
+        <w:t>Test Cases</w:t>
       </w:r>
     </w:p>
     <w:p>
@@ -5572,7 +5556,7 @@
         <w:t>import org.junit.jupiter.api.Test;</w:t>
         <w:br/>
         <w:br/>
-        <w:t>// JUnit 5 tests to verify Decorator pattern behavior</w:t>
+        <w:t>// Console-based tests to verify Decorator pattern behavior</w:t>
         <w:br/>
         <w:t>class DecoratorTest {</w:t>
         <w:br/>
@@ -5720,9 +5704,7 @@
       </w:r>
     </w:p>
     <w:p>
-      <w:r>
-        <w:br w:type="page"/>
-      </w:r>
+      <w:r/>
     </w:p>
     <w:p>
       <w:pPr>
@@ -6262,9 +6244,7 @@
       </w:r>
     </w:p>
     <w:p>
-      <w:r>
-        <w:br w:type="page"/>
-      </w:r>
+      <w:r/>
     </w:p>
     <w:p>
       <w:pPr>
@@ -6624,7 +6604,7 @@
         <w:t>import org.junit.jupiter.api.Test;</w:t>
         <w:br/>
         <w:br/>
-        <w:t>// JUnit 5 tests to verify the Student Services Module integration</w:t>
+        <w:t>// Console-based tests for the Student Services Module</w:t>
         <w:br/>
         <w:t>class ServicesTest {</w:t>
         <w:br/>

</xml_diff>